<commit_message>
updated video and reference shots
</commit_message>
<xml_diff>
--- a/SciFi Video/signal_shotlist_V2.docx
+++ b/SciFi Video/signal_shotlist_V2.docx
@@ -103,12 +103,6 @@
         <w:gridCol w:w="5160"/>
       </w:tblGrid>
       <w:tr>
-        <w:tblPrEx>
-          <w:tblCellMar>
-            <w:top w:w="0" w:type="dxa"/>
-            <w:bottom w:w="0" w:type="dxa"/>
-          </w:tblCellMar>
-        </w:tblPrEx>
         <w:tc>
           <w:tcPr>
             <w:tcW w:w="2400" w:type="dxa"/>
@@ -201,12 +195,6 @@
         </w:tc>
       </w:tr>
       <w:tr>
-        <w:tblPrEx>
-          <w:tblCellMar>
-            <w:top w:w="0" w:type="dxa"/>
-            <w:bottom w:w="0" w:type="dxa"/>
-          </w:tblCellMar>
-        </w:tblPrEx>
         <w:tc>
           <w:tcPr>
             <w:tcW w:w="2400" w:type="dxa"/>
@@ -295,12 +283,6 @@
         </w:tc>
       </w:tr>
       <w:tr>
-        <w:tblPrEx>
-          <w:tblCellMar>
-            <w:top w:w="0" w:type="dxa"/>
-            <w:bottom w:w="0" w:type="dxa"/>
-          </w:tblCellMar>
-        </w:tblPrEx>
         <w:tc>
           <w:tcPr>
             <w:tcW w:w="2400" w:type="dxa"/>
@@ -389,12 +371,6 @@
         </w:tc>
       </w:tr>
       <w:tr>
-        <w:tblPrEx>
-          <w:tblCellMar>
-            <w:top w:w="0" w:type="dxa"/>
-            <w:bottom w:w="0" w:type="dxa"/>
-          </w:tblCellMar>
-        </w:tblPrEx>
         <w:tc>
           <w:tcPr>
             <w:tcW w:w="2400" w:type="dxa"/>
@@ -483,12 +459,6 @@
         </w:tc>
       </w:tr>
       <w:tr>
-        <w:tblPrEx>
-          <w:tblCellMar>
-            <w:top w:w="0" w:type="dxa"/>
-            <w:bottom w:w="0" w:type="dxa"/>
-          </w:tblCellMar>
-        </w:tblPrEx>
         <w:tc>
           <w:tcPr>
             <w:tcW w:w="2400" w:type="dxa"/>
@@ -577,12 +547,6 @@
         </w:tc>
       </w:tr>
       <w:tr>
-        <w:tblPrEx>
-          <w:tblCellMar>
-            <w:top w:w="0" w:type="dxa"/>
-            <w:bottom w:w="0" w:type="dxa"/>
-          </w:tblCellMar>
-        </w:tblPrEx>
         <w:tc>
           <w:tcPr>
             <w:tcW w:w="2400" w:type="dxa"/>
@@ -671,12 +635,6 @@
         </w:tc>
       </w:tr>
       <w:tr>
-        <w:tblPrEx>
-          <w:tblCellMar>
-            <w:top w:w="0" w:type="dxa"/>
-            <w:bottom w:w="0" w:type="dxa"/>
-          </w:tblCellMar>
-        </w:tblPrEx>
         <w:tc>
           <w:tcPr>
             <w:tcW w:w="2400" w:type="dxa"/>
@@ -783,12 +741,6 @@
         </w:tc>
       </w:tr>
       <w:tr>
-        <w:tblPrEx>
-          <w:tblCellMar>
-            <w:top w:w="0" w:type="dxa"/>
-            <w:bottom w:w="0" w:type="dxa"/>
-          </w:tblCellMar>
-        </w:tblPrEx>
         <w:tc>
           <w:tcPr>
             <w:tcW w:w="2400" w:type="dxa"/>
@@ -877,12 +829,6 @@
         </w:tc>
       </w:tr>
       <w:tr>
-        <w:tblPrEx>
-          <w:tblCellMar>
-            <w:top w:w="0" w:type="dxa"/>
-            <w:bottom w:w="0" w:type="dxa"/>
-          </w:tblCellMar>
-        </w:tblPrEx>
         <w:tc>
           <w:tcPr>
             <w:tcW w:w="2400" w:type="dxa"/>
@@ -971,12 +917,6 @@
         </w:tc>
       </w:tr>
       <w:tr>
-        <w:tblPrEx>
-          <w:tblCellMar>
-            <w:top w:w="0" w:type="dxa"/>
-            <w:bottom w:w="0" w:type="dxa"/>
-          </w:tblCellMar>
-        </w:tblPrEx>
         <w:tc>
           <w:tcPr>
             <w:tcW w:w="2400" w:type="dxa"/>
@@ -1065,12 +1005,6 @@
         </w:tc>
       </w:tr>
       <w:tr>
-        <w:tblPrEx>
-          <w:tblCellMar>
-            <w:top w:w="0" w:type="dxa"/>
-            <w:bottom w:w="0" w:type="dxa"/>
-          </w:tblCellMar>
-        </w:tblPrEx>
         <w:tc>
           <w:tcPr>
             <w:tcW w:w="2400" w:type="dxa"/>
@@ -1177,12 +1111,6 @@
         </w:tc>
       </w:tr>
       <w:tr>
-        <w:tblPrEx>
-          <w:tblCellMar>
-            <w:top w:w="0" w:type="dxa"/>
-            <w:bottom w:w="0" w:type="dxa"/>
-          </w:tblCellMar>
-        </w:tblPrEx>
         <w:tc>
           <w:tcPr>
             <w:tcW w:w="2400" w:type="dxa"/>
@@ -1289,12 +1217,6 @@
         </w:tc>
       </w:tr>
       <w:tr>
-        <w:tblPrEx>
-          <w:tblCellMar>
-            <w:top w:w="0" w:type="dxa"/>
-            <w:bottom w:w="0" w:type="dxa"/>
-          </w:tblCellMar>
-        </w:tblPrEx>
         <w:tc>
           <w:tcPr>
             <w:tcW w:w="2400" w:type="dxa"/>
@@ -1460,12 +1382,6 @@
         <w:gridCol w:w="9360"/>
       </w:tblGrid>
       <w:tr>
-        <w:tblPrEx>
-          <w:tblCellMar>
-            <w:top w:w="0" w:type="dxa"/>
-            <w:bottom w:w="0" w:type="dxa"/>
-          </w:tblCellMar>
-        </w:tblPrEx>
         <w:tc>
           <w:tcPr>
             <w:tcW w:w="9360" w:type="dxa"/>
@@ -1859,12 +1775,6 @@
         <w:gridCol w:w="9360"/>
       </w:tblGrid>
       <w:tr>
-        <w:tblPrEx>
-          <w:tblCellMar>
-            <w:top w:w="0" w:type="dxa"/>
-            <w:bottom w:w="0" w:type="dxa"/>
-          </w:tblCellMar>
-        </w:tblPrEx>
         <w:tc>
           <w:tcPr>
             <w:tcW w:w="9360" w:type="dxa"/>
@@ -2218,12 +2128,6 @@
         <w:gridCol w:w="9360"/>
       </w:tblGrid>
       <w:tr>
-        <w:tblPrEx>
-          <w:tblCellMar>
-            <w:top w:w="0" w:type="dxa"/>
-            <w:bottom w:w="0" w:type="dxa"/>
-          </w:tblCellMar>
-        </w:tblPrEx>
         <w:tc>
           <w:tcPr>
             <w:tcW w:w="9360" w:type="dxa"/>
@@ -2316,12 +2220,6 @@
         <w:gridCol w:w="7460"/>
       </w:tblGrid>
       <w:tr>
-        <w:tblPrEx>
-          <w:tblCellMar>
-            <w:top w:w="0" w:type="dxa"/>
-            <w:bottom w:w="0" w:type="dxa"/>
-          </w:tblCellMar>
-        </w:tblPrEx>
         <w:tc>
           <w:tcPr>
             <w:tcW w:w="1900" w:type="dxa"/>
@@ -2791,12 +2689,6 @@
         <w:gridCol w:w="7460"/>
       </w:tblGrid>
       <w:tr>
-        <w:tblPrEx>
-          <w:tblCellMar>
-            <w:top w:w="0" w:type="dxa"/>
-            <w:bottom w:w="0" w:type="dxa"/>
-          </w:tblCellMar>
-        </w:tblPrEx>
         <w:tc>
           <w:tcPr>
             <w:tcW w:w="1900" w:type="dxa"/>
@@ -3312,12 +3204,6 @@
         <w:gridCol w:w="7460"/>
       </w:tblGrid>
       <w:tr>
-        <w:tblPrEx>
-          <w:tblCellMar>
-            <w:top w:w="0" w:type="dxa"/>
-            <w:bottom w:w="0" w:type="dxa"/>
-          </w:tblCellMar>
-        </w:tblPrEx>
         <w:tc>
           <w:tcPr>
             <w:tcW w:w="1900" w:type="dxa"/>
@@ -3901,12 +3787,6 @@
         <w:gridCol w:w="7460"/>
       </w:tblGrid>
       <w:tr>
-        <w:tblPrEx>
-          <w:tblCellMar>
-            <w:top w:w="0" w:type="dxa"/>
-            <w:bottom w:w="0" w:type="dxa"/>
-          </w:tblCellMar>
-        </w:tblPrEx>
         <w:tc>
           <w:tcPr>
             <w:tcW w:w="1900" w:type="dxa"/>
@@ -4297,25 +4177,7 @@
                 <w:sz w:val="17"/>
                 <w:szCs w:val="17"/>
               </w:rPr>
-              <w:t xml:space="preserve"> Mara, the character is </w:t>
-            </w:r>
-            <w:r>
-              <w:rPr>
-                <w:rFonts w:ascii="Courier New" w:eastAsia="Courier New" w:hAnsi="Courier New" w:cs="Courier New"/>
-                <w:color w:val="1A1A1A"/>
-                <w:sz w:val="17"/>
-                <w:szCs w:val="17"/>
-              </w:rPr>
-              <w:t>a young east Asian girl of 10 years old</w:t>
-            </w:r>
-            <w:r>
-              <w:rPr>
-                <w:rFonts w:ascii="Courier New" w:eastAsia="Courier New" w:hAnsi="Courier New" w:cs="Courier New"/>
-                <w:color w:val="1A1A1A"/>
-                <w:sz w:val="17"/>
-                <w:szCs w:val="17"/>
-              </w:rPr>
-              <w:t>.</w:t>
+              <w:t xml:space="preserve"> Mara, the character is a young east Asian girl of 10 years old.</w:t>
             </w:r>
           </w:p>
           <w:p>
@@ -4603,12 +4465,6 @@
         <w:gridCol w:w="7460"/>
       </w:tblGrid>
       <w:tr>
-        <w:tblPrEx>
-          <w:tblCellMar>
-            <w:top w:w="0" w:type="dxa"/>
-            <w:bottom w:w="0" w:type="dxa"/>
-          </w:tblCellMar>
-        </w:tblPrEx>
         <w:tc>
           <w:tcPr>
             <w:tcW w:w="1900" w:type="dxa"/>
@@ -5167,12 +5023,6 @@
         <w:gridCol w:w="7460"/>
       </w:tblGrid>
       <w:tr>
-        <w:tblPrEx>
-          <w:tblCellMar>
-            <w:top w:w="0" w:type="dxa"/>
-            <w:bottom w:w="0" w:type="dxa"/>
-          </w:tblCellMar>
-        </w:tblPrEx>
         <w:tc>
           <w:tcPr>
             <w:tcW w:w="1900" w:type="dxa"/>
@@ -5722,12 +5572,6 @@
         <w:gridCol w:w="9360"/>
       </w:tblGrid>
       <w:tr>
-        <w:tblPrEx>
-          <w:tblCellMar>
-            <w:top w:w="0" w:type="dxa"/>
-            <w:bottom w:w="0" w:type="dxa"/>
-          </w:tblCellMar>
-        </w:tblPrEx>
         <w:tc>
           <w:tcPr>
             <w:tcW w:w="9360" w:type="dxa"/>
@@ -5842,12 +5686,6 @@
         <w:gridCol w:w="7460"/>
       </w:tblGrid>
       <w:tr>
-        <w:tblPrEx>
-          <w:tblCellMar>
-            <w:top w:w="0" w:type="dxa"/>
-            <w:bottom w:w="0" w:type="dxa"/>
-          </w:tblCellMar>
-        </w:tblPrEx>
         <w:tc>
           <w:tcPr>
             <w:tcW w:w="1900" w:type="dxa"/>
@@ -6421,12 +6259,6 @@
         <w:gridCol w:w="7460"/>
       </w:tblGrid>
       <w:tr>
-        <w:tblPrEx>
-          <w:tblCellMar>
-            <w:top w:w="0" w:type="dxa"/>
-            <w:bottom w:w="0" w:type="dxa"/>
-          </w:tblCellMar>
-        </w:tblPrEx>
         <w:tc>
           <w:tcPr>
             <w:tcW w:w="1900" w:type="dxa"/>
@@ -6978,12 +6810,6 @@
         <w:gridCol w:w="7460"/>
       </w:tblGrid>
       <w:tr>
-        <w:tblPrEx>
-          <w:tblCellMar>
-            <w:top w:w="0" w:type="dxa"/>
-            <w:bottom w:w="0" w:type="dxa"/>
-          </w:tblCellMar>
-        </w:tblPrEx>
         <w:tc>
           <w:tcPr>
             <w:tcW w:w="1900" w:type="dxa"/>
@@ -7645,12 +7471,6 @@
         <w:gridCol w:w="7460"/>
       </w:tblGrid>
       <w:tr>
-        <w:tblPrEx>
-          <w:tblCellMar>
-            <w:top w:w="0" w:type="dxa"/>
-            <w:bottom w:w="0" w:type="dxa"/>
-          </w:tblCellMar>
-        </w:tblPrEx>
         <w:tc>
           <w:tcPr>
             <w:tcW w:w="1900" w:type="dxa"/>
@@ -8277,12 +8097,6 @@
         <w:gridCol w:w="7460"/>
       </w:tblGrid>
       <w:tr>
-        <w:tblPrEx>
-          <w:tblCellMar>
-            <w:top w:w="0" w:type="dxa"/>
-            <w:bottom w:w="0" w:type="dxa"/>
-          </w:tblCellMar>
-        </w:tblPrEx>
         <w:tc>
           <w:tcPr>
             <w:tcW w:w="1900" w:type="dxa"/>
@@ -8863,12 +8677,6 @@
         <w:gridCol w:w="7460"/>
       </w:tblGrid>
       <w:tr>
-        <w:tblPrEx>
-          <w:tblCellMar>
-            <w:top w:w="0" w:type="dxa"/>
-            <w:bottom w:w="0" w:type="dxa"/>
-          </w:tblCellMar>
-        </w:tblPrEx>
         <w:tc>
           <w:tcPr>
             <w:tcW w:w="1900" w:type="dxa"/>
@@ -9417,12 +9225,6 @@
         <w:gridCol w:w="7460"/>
       </w:tblGrid>
       <w:tr>
-        <w:tblPrEx>
-          <w:tblCellMar>
-            <w:top w:w="0" w:type="dxa"/>
-            <w:bottom w:w="0" w:type="dxa"/>
-          </w:tblCellMar>
-        </w:tblPrEx>
         <w:tc>
           <w:tcPr>
             <w:tcW w:w="1900" w:type="dxa"/>
@@ -9959,12 +9761,6 @@
         <w:gridCol w:w="7460"/>
       </w:tblGrid>
       <w:tr>
-        <w:tblPrEx>
-          <w:tblCellMar>
-            <w:top w:w="0" w:type="dxa"/>
-            <w:bottom w:w="0" w:type="dxa"/>
-          </w:tblCellMar>
-        </w:tblPrEx>
         <w:tc>
           <w:tcPr>
             <w:tcW w:w="1900" w:type="dxa"/>
@@ -10545,12 +10341,6 @@
         <w:gridCol w:w="7460"/>
       </w:tblGrid>
       <w:tr>
-        <w:tblPrEx>
-          <w:tblCellMar>
-            <w:top w:w="0" w:type="dxa"/>
-            <w:bottom w:w="0" w:type="dxa"/>
-          </w:tblCellMar>
-        </w:tblPrEx>
         <w:tc>
           <w:tcPr>
             <w:tcW w:w="1900" w:type="dxa"/>
@@ -11287,12 +11077,6 @@
         <w:gridCol w:w="9360"/>
       </w:tblGrid>
       <w:tr>
-        <w:tblPrEx>
-          <w:tblCellMar>
-            <w:top w:w="0" w:type="dxa"/>
-            <w:bottom w:w="0" w:type="dxa"/>
-          </w:tblCellMar>
-        </w:tblPrEx>
         <w:tc>
           <w:tcPr>
             <w:tcW w:w="9360" w:type="dxa"/>
@@ -11407,12 +11191,6 @@
         <w:gridCol w:w="7460"/>
       </w:tblGrid>
       <w:tr>
-        <w:tblPrEx>
-          <w:tblCellMar>
-            <w:top w:w="0" w:type="dxa"/>
-            <w:bottom w:w="0" w:type="dxa"/>
-          </w:tblCellMar>
-        </w:tblPrEx>
         <w:tc>
           <w:tcPr>
             <w:tcW w:w="1900" w:type="dxa"/>
@@ -12101,12 +11879,6 @@
         <w:gridCol w:w="7460"/>
       </w:tblGrid>
       <w:tr>
-        <w:tblPrEx>
-          <w:tblCellMar>
-            <w:top w:w="0" w:type="dxa"/>
-            <w:bottom w:w="0" w:type="dxa"/>
-          </w:tblCellMar>
-        </w:tblPrEx>
         <w:tc>
           <w:tcPr>
             <w:tcW w:w="1900" w:type="dxa"/>
@@ -12286,6 +12058,12 @@
           <w:p>
             <w:pPr>
               <w:spacing w:after="60"/>
+              <w:rPr>
+                <w:rFonts w:ascii="Courier New" w:eastAsia="Courier New" w:hAnsi="Courier New" w:cs="Courier New"/>
+                <w:color w:val="1A1A1A"/>
+                <w:sz w:val="17"/>
+                <w:szCs w:val="17"/>
+              </w:rPr>
             </w:pPr>
             <w:r>
               <w:rPr>
@@ -12305,27 +12083,105 @@
                 <w:sz w:val="17"/>
                 <w:szCs w:val="17"/>
               </w:rPr>
-              <w:t xml:space="preserve"> Full decommissioned coal plant in context, Pacific Northwest 2050. Multiple industrial</w:t>
-            </w:r>
-          </w:p>
-          <w:p>
-            <w:pPr>
-              <w:spacing w:after="60"/>
-            </w:pPr>
-            <w:r>
-              <w:rPr>
-                <w:rFonts w:ascii="Courier New" w:eastAsia="Courier New" w:hAnsi="Courier New" w:cs="Courier New"/>
-                <w:color w:val="1A1A1A"/>
-                <w:sz w:val="17"/>
-                <w:szCs w:val="17"/>
-              </w:rPr>
-              <w:t>robots working across plant structures — systematic, ongoing, small at this scale. Clean river</w:t>
-            </w:r>
-          </w:p>
-          <w:p>
-            <w:pPr>
-              <w:spacing w:after="60"/>
-            </w:pPr>
+              <w:t xml:space="preserve"> </w:t>
+            </w:r>
+            <w:r>
+              <w:rPr>
+                <w:rFonts w:ascii="Courier New" w:eastAsia="Courier New" w:hAnsi="Courier New" w:cs="Courier New"/>
+                <w:color w:val="1A1A1A"/>
+                <w:sz w:val="17"/>
+                <w:szCs w:val="17"/>
+              </w:rPr>
+              <w:t>C</w:t>
+            </w:r>
+            <w:r>
+              <w:rPr>
+                <w:rFonts w:ascii="Courier New" w:eastAsia="Courier New" w:hAnsi="Courier New" w:cs="Courier New"/>
+                <w:color w:val="1A1A1A"/>
+                <w:sz w:val="17"/>
+                <w:szCs w:val="17"/>
+              </w:rPr>
+              <w:t xml:space="preserve">oal plant </w:t>
+            </w:r>
+            <w:r>
+              <w:rPr>
+                <w:rFonts w:ascii="Courier New" w:eastAsia="Courier New" w:hAnsi="Courier New" w:cs="Courier New"/>
+                <w:color w:val="1A1A1A"/>
+                <w:sz w:val="17"/>
+                <w:szCs w:val="17"/>
+              </w:rPr>
+              <w:t xml:space="preserve">fully decommissioned (no steam whatsoever and coal stacks half dismantled) </w:t>
+            </w:r>
+            <w:r>
+              <w:rPr>
+                <w:rFonts w:ascii="Courier New" w:eastAsia="Courier New" w:hAnsi="Courier New" w:cs="Courier New"/>
+                <w:color w:val="1A1A1A"/>
+                <w:sz w:val="17"/>
+                <w:szCs w:val="17"/>
+              </w:rPr>
+              <w:t>context, Pacific Northwest 2050. Multiple industrial</w:t>
+            </w:r>
+            <w:r>
+              <w:rPr>
+                <w:rFonts w:ascii="Courier New" w:eastAsia="Courier New" w:hAnsi="Courier New" w:cs="Courier New"/>
+                <w:color w:val="1A1A1A"/>
+                <w:sz w:val="17"/>
+                <w:szCs w:val="17"/>
+              </w:rPr>
+              <w:t xml:space="preserve"> </w:t>
+            </w:r>
+            <w:r>
+              <w:rPr>
+                <w:rFonts w:ascii="Courier New" w:eastAsia="Courier New" w:hAnsi="Courier New" w:cs="Courier New"/>
+                <w:color w:val="1A1A1A"/>
+                <w:sz w:val="17"/>
+                <w:szCs w:val="17"/>
+              </w:rPr>
+              <w:t xml:space="preserve">robots working across plant </w:t>
+            </w:r>
+            <w:proofErr w:type="gramStart"/>
+            <w:r>
+              <w:rPr>
+                <w:rFonts w:ascii="Courier New" w:eastAsia="Courier New" w:hAnsi="Courier New" w:cs="Courier New"/>
+                <w:color w:val="1A1A1A"/>
+                <w:sz w:val="17"/>
+                <w:szCs w:val="17"/>
+              </w:rPr>
+              <w:t>structures — systematic</w:t>
+            </w:r>
+            <w:proofErr w:type="gramEnd"/>
+            <w:r>
+              <w:rPr>
+                <w:rFonts w:ascii="Courier New" w:eastAsia="Courier New" w:hAnsi="Courier New" w:cs="Courier New"/>
+                <w:color w:val="1A1A1A"/>
+                <w:sz w:val="17"/>
+                <w:szCs w:val="17"/>
+              </w:rPr>
+              <w:t xml:space="preserve">, ongoing, small at this scale. </w:t>
+            </w:r>
+          </w:p>
+          <w:p>
+            <w:pPr>
+              <w:spacing w:after="60"/>
+            </w:pPr>
+            <w:r>
+              <w:rPr>
+                <w:rFonts w:ascii="Courier New" w:eastAsia="Courier New" w:hAnsi="Courier New" w:cs="Courier New"/>
+                <w:color w:val="1A1A1A"/>
+                <w:sz w:val="17"/>
+                <w:szCs w:val="17"/>
+              </w:rPr>
+              <w:t>Clean river</w:t>
+            </w:r>
+            <w:r>
+              <w:rPr>
+                <w:rFonts w:ascii="Courier New" w:eastAsia="Courier New" w:hAnsi="Courier New" w:cs="Courier New"/>
+                <w:color w:val="1A1A1A"/>
+                <w:sz w:val="17"/>
+                <w:szCs w:val="17"/>
+              </w:rPr>
+              <w:t xml:space="preserve"> </w:t>
+            </w:r>
             <w:r>
               <w:rPr>
                 <w:rFonts w:ascii="Courier New" w:eastAsia="Courier New" w:hAnsi="Courier New" w:cs="Courier New"/>
@@ -12335,11 +12191,15 @@
               </w:rPr>
               <w:t>running along lower site edge. Remaining plant structures with integrated solar panel surfaces</w:t>
             </w:r>
-          </w:p>
-          <w:p>
-            <w:pPr>
-              <w:spacing w:after="60"/>
-            </w:pPr>
+            <w:r>
+              <w:rPr>
+                <w:rFonts w:ascii="Courier New" w:eastAsia="Courier New" w:hAnsi="Courier New" w:cs="Courier New"/>
+                <w:color w:val="1A1A1A"/>
+                <w:sz w:val="17"/>
+                <w:szCs w:val="17"/>
+              </w:rPr>
+              <w:t xml:space="preserve"> </w:t>
+            </w:r>
             <w:r>
               <w:rPr>
                 <w:rFonts w:ascii="Courier New" w:eastAsia="Courier New" w:hAnsi="Courier New" w:cs="Courier New"/>
@@ -12417,19 +12277,41 @@
               </w:rPr>
               <w:t>Hydro structure where river bends — low-profile, integrated. If Mara visible she is tiny and</w:t>
             </w:r>
-          </w:p>
-          <w:p>
-            <w:pPr>
-              <w:spacing w:after="60"/>
-            </w:pPr>
-            <w:r>
-              <w:rPr>
-                <w:rFonts w:ascii="Courier New" w:eastAsia="Courier New" w:hAnsi="Courier New" w:cs="Courier New"/>
-                <w:color w:val="1A1A1A"/>
-                <w:sz w:val="17"/>
-                <w:szCs w:val="17"/>
-              </w:rPr>
-              <w:t>distant.</w:t>
+            <w:r>
+              <w:rPr>
+                <w:rFonts w:ascii="Courier New" w:eastAsia="Courier New" w:hAnsi="Courier New" w:cs="Courier New"/>
+                <w:color w:val="1A1A1A"/>
+                <w:sz w:val="17"/>
+                <w:szCs w:val="17"/>
+              </w:rPr>
+              <w:t xml:space="preserve"> </w:t>
+            </w:r>
+            <w:r>
+              <w:rPr>
+                <w:rFonts w:ascii="Courier New" w:eastAsia="Courier New" w:hAnsi="Courier New" w:cs="Courier New"/>
+                <w:color w:val="1A1A1A"/>
+                <w:sz w:val="17"/>
+                <w:szCs w:val="17"/>
+              </w:rPr>
+              <w:t>distant</w:t>
+            </w:r>
+            <w:r>
+              <w:rPr>
+                <w:rFonts w:ascii="Courier New" w:eastAsia="Courier New" w:hAnsi="Courier New" w:cs="Courier New"/>
+                <w:color w:val="1A1A1A"/>
+                <w:sz w:val="17"/>
+                <w:szCs w:val="17"/>
+              </w:rPr>
+              <w:t xml:space="preserve"> and moving along the ground seated in her pod</w:t>
+            </w:r>
+            <w:r>
+              <w:rPr>
+                <w:rFonts w:ascii="Courier New" w:eastAsia="Courier New" w:hAnsi="Courier New" w:cs="Courier New"/>
+                <w:color w:val="1A1A1A"/>
+                <w:sz w:val="17"/>
+                <w:szCs w:val="17"/>
+              </w:rPr>
+              <w:t>.</w:t>
             </w:r>
           </w:p>
           <w:p>
@@ -12740,12 +12622,6 @@
         <w:gridCol w:w="7460"/>
       </w:tblGrid>
       <w:tr>
-        <w:tblPrEx>
-          <w:tblCellMar>
-            <w:top w:w="0" w:type="dxa"/>
-            <w:bottom w:w="0" w:type="dxa"/>
-          </w:tblCellMar>
-        </w:tblPrEx>
         <w:tc>
           <w:tcPr>
             <w:tcW w:w="1900" w:type="dxa"/>
@@ -12978,21 +12854,21 @@
                 <w:sz w:val="17"/>
                 <w:szCs w:val="17"/>
               </w:rPr>
+              <w:t>corner of left lens: small green LED dot blinks — once, then twice. Only green element in</w:t>
+            </w:r>
+          </w:p>
+          <w:p>
+            <w:pPr>
+              <w:spacing w:after="60"/>
+            </w:pPr>
+            <w:r>
+              <w:rPr>
+                <w:rFonts w:ascii="Courier New" w:eastAsia="Courier New" w:hAnsi="Courier New" w:cs="Courier New"/>
+                <w:color w:val="1A1A1A"/>
+                <w:sz w:val="17"/>
+                <w:szCs w:val="17"/>
+              </w:rPr>
               <w:lastRenderedPageBreak/>
-              <w:t>corner of left lens: small green LED dot blinks — once, then twice. Only green element in</w:t>
-            </w:r>
-          </w:p>
-          <w:p>
-            <w:pPr>
-              <w:spacing w:after="60"/>
-            </w:pPr>
-            <w:r>
-              <w:rPr>
-                <w:rFonts w:ascii="Courier New" w:eastAsia="Courier New" w:hAnsi="Courier New" w:cs="Courier New"/>
-                <w:color w:val="1A1A1A"/>
-                <w:sz w:val="17"/>
-                <w:szCs w:val="17"/>
-              </w:rPr>
               <w:t>the warm amber frame. After second blink: her eyes shift direction slightly. Then she begins</w:t>
             </w:r>
           </w:p>
@@ -13345,6 +13221,24 @@
                 <w:szCs w:val="17"/>
               </w:rPr>
               <w:t>VR/AR device.</w:t>
+            </w:r>
+            <w:r>
+              <w:rPr>
+                <w:rFonts w:ascii="Courier New" w:eastAsia="Courier New" w:hAnsi="Courier New" w:cs="Courier New"/>
+                <w:color w:val="1A1A1A"/>
+                <w:sz w:val="17"/>
+                <w:szCs w:val="17"/>
+              </w:rPr>
+              <w:t xml:space="preserve"> </w:t>
+            </w:r>
+            <w:r>
+              <w:rPr>
+                <w:rFonts w:ascii="Courier New" w:eastAsia="Courier New" w:hAnsi="Courier New" w:cs="Courier New"/>
+                <w:color w:val="1A1A1A"/>
+                <w:sz w:val="17"/>
+                <w:szCs w:val="17"/>
+              </w:rPr>
+              <w:t>No buildings in background, only woods.</w:t>
             </w:r>
           </w:p>
         </w:tc>
@@ -13385,12 +13279,6 @@
         <w:gridCol w:w="7460"/>
       </w:tblGrid>
       <w:tr>
-        <w:tblPrEx>
-          <w:tblCellMar>
-            <w:top w:w="0" w:type="dxa"/>
-            <w:bottom w:w="0" w:type="dxa"/>
-          </w:tblCellMar>
-        </w:tblPrEx>
         <w:tc>
           <w:tcPr>
             <w:tcW w:w="1900" w:type="dxa"/>
@@ -13791,23 +13679,23 @@
                 <w:sz w:val="16"/>
                 <w:szCs w:val="16"/>
               </w:rPr>
+              <w:t xml:space="preserve"> </w:t>
+            </w:r>
+          </w:p>
+          <w:p>
+            <w:pPr>
+              <w:spacing w:after="60"/>
+            </w:pPr>
+            <w:r>
+              <w:rPr>
+                <w:rFonts w:ascii="Courier New" w:eastAsia="Courier New" w:hAnsi="Courier New" w:cs="Courier New"/>
+                <w:b/>
+                <w:bCs/>
+                <w:color w:val="0D2B6B"/>
+                <w:sz w:val="17"/>
+                <w:szCs w:val="17"/>
+              </w:rPr>
               <w:lastRenderedPageBreak/>
-              <w:t xml:space="preserve"> </w:t>
-            </w:r>
-          </w:p>
-          <w:p>
-            <w:pPr>
-              <w:spacing w:after="60"/>
-            </w:pPr>
-            <w:r>
-              <w:rPr>
-                <w:rFonts w:ascii="Courier New" w:eastAsia="Courier New" w:hAnsi="Courier New" w:cs="Courier New"/>
-                <w:b/>
-                <w:bCs/>
-                <w:color w:val="0D2B6B"/>
-                <w:sz w:val="17"/>
-                <w:szCs w:val="17"/>
-              </w:rPr>
               <w:t>LIGHTING:</w:t>
             </w:r>
             <w:r>
@@ -13935,6 +13823,15 @@
               </w:rPr>
               <w:t>unintelligible, no words, just sound. No dramatic music. No sci-fi pod sounds. No dialogue.</w:t>
             </w:r>
+            <w:r>
+              <w:rPr>
+                <w:rFonts w:ascii="Courier New" w:eastAsia="Courier New" w:hAnsi="Courier New" w:cs="Courier New"/>
+                <w:color w:val="1A1A1A"/>
+                <w:sz w:val="17"/>
+                <w:szCs w:val="17"/>
+              </w:rPr>
+              <w:t xml:space="preserve"> </w:t>
+            </w:r>
           </w:p>
           <w:p>
             <w:pPr>
@@ -13989,6 +13886,7 @@
             <w:pPr>
               <w:spacing w:after="60"/>
             </w:pPr>
+            <w:proofErr w:type="gramStart"/>
             <w:r>
               <w:rPr>
                 <w:rFonts w:ascii="Courier New" w:eastAsia="Courier New" w:hAnsi="Courier New" w:cs="Courier New"/>
@@ -13998,7 +13896,19 @@
                 <w:sz w:val="17"/>
                 <w:szCs w:val="17"/>
               </w:rPr>
-              <w:t>NO:</w:t>
+              <w:t>NO</w:t>
+            </w:r>
+            <w:proofErr w:type="gramEnd"/>
+            <w:r>
+              <w:rPr>
+                <w:rFonts w:ascii="Courier New" w:eastAsia="Courier New" w:hAnsi="Courier New" w:cs="Courier New"/>
+                <w:b/>
+                <w:bCs/>
+                <w:color w:val="AA0000"/>
+                <w:sz w:val="17"/>
+                <w:szCs w:val="17"/>
+              </w:rPr>
+              <w:t>:</w:t>
             </w:r>
             <w:r>
               <w:rPr>
@@ -14009,19 +13919,32 @@
               </w:rPr>
               <w:t xml:space="preserve"> no dramatic music swell, no sci-fi sound effects on pod, no slow motion, no pod glow</w:t>
             </w:r>
-          </w:p>
-          <w:p>
-            <w:pPr>
-              <w:spacing w:after="60"/>
-            </w:pPr>
-            <w:r>
-              <w:rPr>
-                <w:rFonts w:ascii="Courier New" w:eastAsia="Courier New" w:hAnsi="Courier New" w:cs="Courier New"/>
-                <w:color w:val="1A1A1A"/>
-                <w:sz w:val="17"/>
-                <w:szCs w:val="17"/>
-              </w:rPr>
-              <w:t>or shimmer, no dramatic lighting — children's voices distant and unintelligible only.</w:t>
+            <w:r>
+              <w:rPr>
+                <w:rFonts w:ascii="Courier New" w:eastAsia="Courier New" w:hAnsi="Courier New" w:cs="Courier New"/>
+                <w:color w:val="1A1A1A"/>
+                <w:sz w:val="17"/>
+                <w:szCs w:val="17"/>
+              </w:rPr>
+              <w:t xml:space="preserve"> </w:t>
+            </w:r>
+            <w:r>
+              <w:rPr>
+                <w:rFonts w:ascii="Courier New" w:eastAsia="Courier New" w:hAnsi="Courier New" w:cs="Courier New"/>
+                <w:color w:val="1A1A1A"/>
+                <w:sz w:val="17"/>
+                <w:szCs w:val="17"/>
+              </w:rPr>
+              <w:t xml:space="preserve">or shimmer, no dramatic lighting — </w:t>
+            </w:r>
+            <w:r>
+              <w:rPr>
+                <w:rFonts w:ascii="Courier New" w:eastAsia="Courier New" w:hAnsi="Courier New" w:cs="Courier New"/>
+                <w:color w:val="1A1A1A"/>
+                <w:sz w:val="17"/>
+                <w:szCs w:val="17"/>
+              </w:rPr>
+              <w:t>no dialogue.</w:t>
             </w:r>
           </w:p>
         </w:tc>
@@ -14062,12 +13985,6 @@
         <w:gridCol w:w="7460"/>
       </w:tblGrid>
       <w:tr>
-        <w:tblPrEx>
-          <w:tblCellMar>
-            <w:top w:w="0" w:type="dxa"/>
-            <w:bottom w:w="0" w:type="dxa"/>
-          </w:tblCellMar>
-        </w:tblPrEx>
         <w:tc>
           <w:tcPr>
             <w:tcW w:w="1900" w:type="dxa"/>
@@ -14516,11 +14433,15 @@
               </w:rPr>
               <w:t>. Laughter. One</w:t>
             </w:r>
-          </w:p>
-          <w:p>
-            <w:pPr>
-              <w:spacing w:after="60"/>
-            </w:pPr>
+            <w:r>
+              <w:rPr>
+                <w:rFonts w:ascii="Courier New" w:eastAsia="Courier New" w:hAnsi="Courier New" w:cs="Courier New"/>
+                <w:color w:val="1A1A1A"/>
+                <w:sz w:val="17"/>
+                <w:szCs w:val="17"/>
+              </w:rPr>
+              <w:t xml:space="preserve"> </w:t>
+            </w:r>
             <w:r>
               <w:rPr>
                 <w:rFonts w:ascii="Courier New" w:eastAsia="Courier New" w:hAnsi="Courier New" w:cs="Courier New"/>
@@ -14530,6 +14451,15 @@
               </w:rPr>
               <w:t>shout. Wind in grass. Water in channel. No music. No narration.</w:t>
             </w:r>
+            <w:r>
+              <w:rPr>
+                <w:rFonts w:ascii="Courier New" w:eastAsia="Courier New" w:hAnsi="Courier New" w:cs="Courier New"/>
+                <w:color w:val="1A1A1A"/>
+                <w:sz w:val="17"/>
+                <w:szCs w:val="17"/>
+              </w:rPr>
+              <w:t xml:space="preserve"> Only children’s laughter.</w:t>
+            </w:r>
           </w:p>
           <w:p>
             <w:pPr>
@@ -14594,63 +14524,63 @@
                 <w:sz w:val="17"/>
                 <w:szCs w:val="17"/>
               </w:rPr>
+              <w:t>NO</w:t>
+            </w:r>
+            <w:proofErr w:type="gramEnd"/>
+            <w:r>
+              <w:rPr>
+                <w:rFonts w:ascii="Courier New" w:eastAsia="Courier New" w:hAnsi="Courier New" w:cs="Courier New"/>
+                <w:b/>
+                <w:bCs/>
+                <w:color w:val="AA0000"/>
+                <w:sz w:val="17"/>
+                <w:szCs w:val="17"/>
+              </w:rPr>
+              <w:t>:</w:t>
+            </w:r>
+            <w:r>
+              <w:rPr>
+                <w:rFonts w:ascii="Courier New" w:eastAsia="Courier New" w:hAnsi="Courier New" w:cs="Courier New"/>
+                <w:color w:val="1A1A1A"/>
+                <w:sz w:val="17"/>
+                <w:szCs w:val="17"/>
+              </w:rPr>
+              <w:t xml:space="preserve"> no posed children, no children looking at </w:t>
+            </w:r>
+            <w:proofErr w:type="gramStart"/>
+            <w:r>
+              <w:rPr>
+                <w:rFonts w:ascii="Courier New" w:eastAsia="Courier New" w:hAnsi="Courier New" w:cs="Courier New"/>
+                <w:color w:val="1A1A1A"/>
+                <w:sz w:val="17"/>
+                <w:szCs w:val="17"/>
+              </w:rPr>
+              <w:t>camera</w:t>
+            </w:r>
+            <w:proofErr w:type="gramEnd"/>
+            <w:r>
+              <w:rPr>
+                <w:rFonts w:ascii="Courier New" w:eastAsia="Courier New" w:hAnsi="Courier New" w:cs="Courier New"/>
+                <w:color w:val="1A1A1A"/>
+                <w:sz w:val="17"/>
+                <w:szCs w:val="17"/>
+              </w:rPr>
+              <w:t>, no symmetrical arrangement, no music,</w:t>
+            </w:r>
+          </w:p>
+          <w:p>
+            <w:pPr>
+              <w:spacing w:after="60"/>
+            </w:pPr>
+            <w:proofErr w:type="gramStart"/>
+            <w:r>
+              <w:rPr>
+                <w:rFonts w:ascii="Courier New" w:eastAsia="Courier New" w:hAnsi="Courier New" w:cs="Courier New"/>
+                <w:color w:val="1A1A1A"/>
+                <w:sz w:val="17"/>
+                <w:szCs w:val="17"/>
+              </w:rPr>
               <w:lastRenderedPageBreak/>
-              <w:t>NO</w:t>
-            </w:r>
-            <w:proofErr w:type="gramEnd"/>
-            <w:r>
-              <w:rPr>
-                <w:rFonts w:ascii="Courier New" w:eastAsia="Courier New" w:hAnsi="Courier New" w:cs="Courier New"/>
-                <w:b/>
-                <w:bCs/>
-                <w:color w:val="AA0000"/>
-                <w:sz w:val="17"/>
-                <w:szCs w:val="17"/>
-              </w:rPr>
-              <w:t>:</w:t>
-            </w:r>
-            <w:r>
-              <w:rPr>
-                <w:rFonts w:ascii="Courier New" w:eastAsia="Courier New" w:hAnsi="Courier New" w:cs="Courier New"/>
-                <w:color w:val="1A1A1A"/>
-                <w:sz w:val="17"/>
-                <w:szCs w:val="17"/>
-              </w:rPr>
-              <w:t xml:space="preserve"> no posed children, no children looking at </w:t>
-            </w:r>
-            <w:proofErr w:type="gramStart"/>
-            <w:r>
-              <w:rPr>
-                <w:rFonts w:ascii="Courier New" w:eastAsia="Courier New" w:hAnsi="Courier New" w:cs="Courier New"/>
-                <w:color w:val="1A1A1A"/>
-                <w:sz w:val="17"/>
-                <w:szCs w:val="17"/>
-              </w:rPr>
-              <w:t>camera</w:t>
-            </w:r>
-            <w:proofErr w:type="gramEnd"/>
-            <w:r>
-              <w:rPr>
-                <w:rFonts w:ascii="Courier New" w:eastAsia="Courier New" w:hAnsi="Courier New" w:cs="Courier New"/>
-                <w:color w:val="1A1A1A"/>
-                <w:sz w:val="17"/>
-                <w:szCs w:val="17"/>
-              </w:rPr>
-              <w:t>, no symmetrical arrangement, no music,</w:t>
-            </w:r>
-          </w:p>
-          <w:p>
-            <w:pPr>
-              <w:spacing w:after="60"/>
-            </w:pPr>
-            <w:proofErr w:type="gramStart"/>
-            <w:r>
-              <w:rPr>
-                <w:rFonts w:ascii="Courier New" w:eastAsia="Courier New" w:hAnsi="Courier New" w:cs="Courier New"/>
-                <w:color w:val="1A1A1A"/>
-                <w:sz w:val="17"/>
-                <w:szCs w:val="17"/>
-              </w:rPr>
               <w:t>no</w:t>
             </w:r>
             <w:proofErr w:type="gramEnd"/>
@@ -14722,12 +14652,6 @@
         <w:gridCol w:w="7460"/>
       </w:tblGrid>
       <w:tr>
-        <w:tblPrEx>
-          <w:tblCellMar>
-            <w:top w:w="0" w:type="dxa"/>
-            <w:bottom w:w="0" w:type="dxa"/>
-          </w:tblCellMar>
-        </w:tblPrEx>
         <w:tc>
           <w:tcPr>
             <w:tcW w:w="1900" w:type="dxa"/>
@@ -15349,12 +15273,6 @@
         <w:gridCol w:w="7460"/>
       </w:tblGrid>
       <w:tr>
-        <w:tblPrEx>
-          <w:tblCellMar>
-            <w:top w:w="0" w:type="dxa"/>
-            <w:bottom w:w="0" w:type="dxa"/>
-          </w:tblCellMar>
-        </w:tblPrEx>
         <w:tc>
           <w:tcPr>
             <w:tcW w:w="1900" w:type="dxa"/>
@@ -15635,19 +15553,19 @@
                 <w:sz w:val="17"/>
                 <w:szCs w:val="17"/>
               </w:rPr>
+              <w:t>distance. Pacific Northwest 2050.</w:t>
+            </w:r>
+          </w:p>
+          <w:p>
+            <w:pPr>
+              <w:spacing w:after="60"/>
+            </w:pPr>
+            <w:r>
+              <w:rPr>
+                <w:sz w:val="16"/>
+                <w:szCs w:val="16"/>
+              </w:rPr>
               <w:lastRenderedPageBreak/>
-              <w:t>distance. Pacific Northwest 2050.</w:t>
-            </w:r>
-          </w:p>
-          <w:p>
-            <w:pPr>
-              <w:spacing w:after="60"/>
-            </w:pPr>
-            <w:r>
-              <w:rPr>
-                <w:sz w:val="16"/>
-                <w:szCs w:val="16"/>
-              </w:rPr>
               <w:t xml:space="preserve"> </w:t>
             </w:r>
           </w:p>
@@ -16086,12 +16004,6 @@
         <w:gridCol w:w="7460"/>
       </w:tblGrid>
       <w:tr>
-        <w:tblPrEx>
-          <w:tblCellMar>
-            <w:top w:w="0" w:type="dxa"/>
-            <w:bottom w:w="0" w:type="dxa"/>
-          </w:tblCellMar>
-        </w:tblPrEx>
         <w:tc>
           <w:tcPr>
             <w:tcW w:w="1900" w:type="dxa"/>
@@ -16530,29 +16442,29 @@
                 <w:sz w:val="17"/>
                 <w:szCs w:val="17"/>
               </w:rPr>
+              <w:t>silver-warm</w:t>
+            </w:r>
+            <w:proofErr w:type="gramEnd"/>
+            <w:r>
+              <w:rPr>
+                <w:rFonts w:ascii="Courier New" w:eastAsia="Courier New" w:hAnsi="Courier New" w:cs="Courier New"/>
+                <w:color w:val="1A1A1A"/>
+                <w:sz w:val="17"/>
+                <w:szCs w:val="17"/>
+              </w:rPr>
+              <w:t>.</w:t>
+            </w:r>
+          </w:p>
+          <w:p>
+            <w:pPr>
+              <w:spacing w:after="60"/>
+            </w:pPr>
+            <w:r>
+              <w:rPr>
+                <w:sz w:val="16"/>
+                <w:szCs w:val="16"/>
+              </w:rPr>
               <w:lastRenderedPageBreak/>
-              <w:t>silver-warm</w:t>
-            </w:r>
-            <w:proofErr w:type="gramEnd"/>
-            <w:r>
-              <w:rPr>
-                <w:rFonts w:ascii="Courier New" w:eastAsia="Courier New" w:hAnsi="Courier New" w:cs="Courier New"/>
-                <w:color w:val="1A1A1A"/>
-                <w:sz w:val="17"/>
-                <w:szCs w:val="17"/>
-              </w:rPr>
-              <w:t>.</w:t>
-            </w:r>
-          </w:p>
-          <w:p>
-            <w:pPr>
-              <w:spacing w:after="60"/>
-            </w:pPr>
-            <w:r>
-              <w:rPr>
-                <w:sz w:val="16"/>
-                <w:szCs w:val="16"/>
-              </w:rPr>
               <w:t xml:space="preserve"> </w:t>
             </w:r>
           </w:p>
@@ -16741,12 +16653,6 @@
         <w:gridCol w:w="7460"/>
       </w:tblGrid>
       <w:tr>
-        <w:tblPrEx>
-          <w:tblCellMar>
-            <w:top w:w="0" w:type="dxa"/>
-            <w:bottom w:w="0" w:type="dxa"/>
-          </w:tblCellMar>
-        </w:tblPrEx>
         <w:tc>
           <w:tcPr>
             <w:tcW w:w="1900" w:type="dxa"/>
@@ -17342,12 +17248,6 @@
         <w:gridCol w:w="7460"/>
       </w:tblGrid>
       <w:tr>
-        <w:tblPrEx>
-          <w:tblCellMar>
-            <w:top w:w="0" w:type="dxa"/>
-            <w:bottom w:w="0" w:type="dxa"/>
-          </w:tblCellMar>
-        </w:tblPrEx>
         <w:tc>
           <w:tcPr>
             <w:tcW w:w="1900" w:type="dxa"/>
@@ -17951,12 +17851,6 @@
         <w:gridCol w:w="7160"/>
       </w:tblGrid>
       <w:tr>
-        <w:tblPrEx>
-          <w:tblCellMar>
-            <w:top w:w="0" w:type="dxa"/>
-            <w:bottom w:w="0" w:type="dxa"/>
-          </w:tblCellMar>
-        </w:tblPrEx>
         <w:tc>
           <w:tcPr>
             <w:tcW w:w="2200" w:type="dxa"/>
@@ -18019,12 +17913,6 @@
         </w:tc>
       </w:tr>
       <w:tr>
-        <w:tblPrEx>
-          <w:tblCellMar>
-            <w:top w:w="0" w:type="dxa"/>
-            <w:bottom w:w="0" w:type="dxa"/>
-          </w:tblCellMar>
-        </w:tblPrEx>
         <w:tc>
           <w:tcPr>
             <w:tcW w:w="2200" w:type="dxa"/>
@@ -18139,12 +18027,6 @@
         </w:tc>
       </w:tr>
       <w:tr>
-        <w:tblPrEx>
-          <w:tblCellMar>
-            <w:top w:w="0" w:type="dxa"/>
-            <w:bottom w:w="0" w:type="dxa"/>
-          </w:tblCellMar>
-        </w:tblPrEx>
         <w:tc>
           <w:tcPr>
             <w:tcW w:w="2200" w:type="dxa"/>
@@ -18277,12 +18159,6 @@
         </w:tc>
       </w:tr>
       <w:tr>
-        <w:tblPrEx>
-          <w:tblCellMar>
-            <w:top w:w="0" w:type="dxa"/>
-            <w:bottom w:w="0" w:type="dxa"/>
-          </w:tblCellMar>
-        </w:tblPrEx>
         <w:tc>
           <w:tcPr>
             <w:tcW w:w="2200" w:type="dxa"/>
@@ -18343,12 +18219,6 @@
         </w:tc>
       </w:tr>
       <w:tr>
-        <w:tblPrEx>
-          <w:tblCellMar>
-            <w:top w:w="0" w:type="dxa"/>
-            <w:bottom w:w="0" w:type="dxa"/>
-          </w:tblCellMar>
-        </w:tblPrEx>
         <w:tc>
           <w:tcPr>
             <w:tcW w:w="2200" w:type="dxa"/>
@@ -18446,12 +18316,6 @@
         </w:tc>
       </w:tr>
       <w:tr>
-        <w:tblPrEx>
-          <w:tblCellMar>
-            <w:top w:w="0" w:type="dxa"/>
-            <w:bottom w:w="0" w:type="dxa"/>
-          </w:tblCellMar>
-        </w:tblPrEx>
         <w:tc>
           <w:tcPr>
             <w:tcW w:w="2200" w:type="dxa"/>
@@ -19106,6 +18970,7 @@
   <w:style w:type="character" w:default="1" w:styleId="DefaultParagraphFont">
     <w:name w:val="Default Paragraph Font"/>
     <w:uiPriority w:val="1"/>
+    <w:semiHidden/>
     <w:unhideWhenUsed/>
   </w:style>
   <w:style w:type="table" w:default="1" w:styleId="TableNormal">

</xml_diff>